<commit_message>
Fix citation format to match course citation rules [Author Year:page]
</commit_message>
<xml_diff>
--- a/cultural_anthropology_essay.docx
+++ b/cultural_anthropology_essay.docx
@@ -26,6 +26,8 @@
       <w:r>
         <w:rPr>
           <w:rFonts w:ascii="MS Mincho" w:cs="MS Mincho" w:eastAsia="MS Mincho" w:hAnsi="MS Mincho"/>
+          <w:b w:val="false"/>
+          <w:bCs w:val="false"/>
           <w:sz w:val="24"/>
           <w:szCs w:val="24"/>
         </w:rPr>
@@ -55,6 +57,8 @@
       <w:r>
         <w:rPr>
           <w:rFonts w:ascii="MS Mincho" w:cs="MS Mincho" w:eastAsia="MS Mincho" w:hAnsi="MS Mincho"/>
+          <w:b w:val="false"/>
+          <w:bCs w:val="false"/>
           <w:sz w:val="24"/>
           <w:szCs w:val="24"/>
         </w:rPr>
@@ -69,6 +73,8 @@
       <w:r>
         <w:rPr>
           <w:rFonts w:ascii="MS Mincho" w:cs="MS Mincho" w:eastAsia="MS Mincho" w:hAnsi="MS Mincho"/>
+          <w:b w:val="false"/>
+          <w:bCs w:val="false"/>
           <w:sz w:val="24"/>
           <w:szCs w:val="24"/>
         </w:rPr>
@@ -98,52 +104,60 @@
       <w:r>
         <w:rPr>
           <w:rFonts w:ascii="MS Mincho" w:cs="MS Mincho" w:eastAsia="MS Mincho" w:hAnsi="MS Mincho"/>
-          <w:sz w:val="24"/>
-          <w:szCs w:val="24"/>
-        </w:rPr>
-        <w:t xml:space="preserve">フランスの社会学者・人類学者マルセル・モースは、1925年に発表した『贈与論』（Essai sur le don）において、北米先住民のポトラッチやメラネシアのクラ交易などの事例を比較分析し、贈与の普遍的な構造を明らかにした。モースが注目したのは、贈与が「自発的に見えながら、実際には義務的であり、外見上は無償でありながら、実際には利益を期待する」という逆説的な性格を持つことである（モース 2014）。</w:t>
-      </w:r>
-    </w:p>
-    <w:p>
-      <w:pPr>
-        <w:spacing w:after="160" w:before="0"/>
-        <w:ind w:firstLine="480"/>
-      </w:pPr>
-      <w:r>
-        <w:rPr>
-          <w:rFonts w:ascii="MS Mincho" w:cs="MS Mincho" w:eastAsia="MS Mincho" w:hAnsi="MS Mincho"/>
-          <w:sz w:val="24"/>
-          <w:szCs w:val="24"/>
-        </w:rPr>
-        <w:t xml:space="preserve">モースは贈与を支える三つの義務を析出した。第一は「与える義務」（obligation to give）である。社会的地位や名誉ある者は、贈り物をしなければならない。与えることを拒むことは、社会的関係の拒否、すなわち敵対の宣言を意味する。第二は「受け取る義務」（obligation to receive）である。贈り物を受け取らないことは、贈り手を侮辱することになる。受取拒否は対等な関係を否定する行為として理解される。第三は「返礼する義務」（obligation to reciprocate）である。贈られた物に対しては、相応の返礼をしなければならない。返礼を怠ることは、社会的信用の失墜につながる。</w:t>
-      </w:r>
-    </w:p>
-    <w:p>
-      <w:pPr>
-        <w:spacing w:after="160" w:before="0"/>
-        <w:ind w:firstLine="480"/>
-      </w:pPr>
-      <w:r>
-        <w:rPr>
-          <w:rFonts w:ascii="MS Mincho" w:cs="MS Mincho" w:eastAsia="MS Mincho" w:hAnsi="MS Mincho"/>
-          <w:sz w:val="24"/>
-          <w:szCs w:val="24"/>
-        </w:rPr>
-        <w:t xml:space="preserve">モースにとって重要なのは、贈り物には「贈り手の霊（ハウ）」が宿るという考え方である。物は移転しても、贈り手との関係が断ち切られるわけではない。贈り物には人格が込められており、返礼とはその人格を元の持ち主に返すことを意味する。こうして贈与のサイクルは、人々の間に継続的な社会的絆を生み出す機能を果たすのである。</w:t>
-      </w:r>
-    </w:p>
-    <w:p>
-      <w:pPr>
-        <w:spacing w:after="160" w:before="0"/>
-        <w:ind w:firstLine="480"/>
-      </w:pPr>
-      <w:r>
-        <w:rPr>
-          <w:rFonts w:ascii="MS Mincho" w:cs="MS Mincho" w:eastAsia="MS Mincho" w:hAnsi="MS Mincho"/>
-          <w:sz w:val="24"/>
-          <w:szCs w:val="24"/>
-        </w:rPr>
-        <w:t xml:space="preserve">また、マーシャル・サーリンズはモースの議論を発展させ、互酬性を「一般的互酬性」「均衡的互酬性」「否定的互酬性」の三類型に整理した（サーリンズ 2012）。一般的互酬性は見返りを期待しない贈与（親の子への愛情など）、均衡的互酬性は即時の等価返礼（市場交換など）、否定的互酬性は相手の損失において自己利益を得ようとする交換である。日本の贈答慣行の多くは均衡的互酬性の領域に位置しながら、長期的な関係維持という一般的互酬性の要素も帯びている。</w:t>
+          <w:b w:val="false"/>
+          <w:bCs w:val="false"/>
+          <w:sz w:val="24"/>
+          <w:szCs w:val="24"/>
+        </w:rPr>
+        <w:t xml:space="preserve">フランスの社会学者・人類学者マルセル・モースは、1925年に発表した『贈与論』（Essai sur le don）において、北米先住民のポトラッチやメラネシアのクラ交易などの事例を比較分析し、贈与の普遍的な構造を明らかにした。モースが注目したのは、贈与が「自発的に見えながら、実際には義務的であり、外見上は無償でありながら、実際には利益を期待する」という逆説的な性格を持つことである［モース 2014：20］。</w:t>
+      </w:r>
+    </w:p>
+    <w:p>
+      <w:pPr>
+        <w:spacing w:after="160" w:before="0"/>
+        <w:ind w:firstLine="480"/>
+      </w:pPr>
+      <w:r>
+        <w:rPr>
+          <w:rFonts w:ascii="MS Mincho" w:cs="MS Mincho" w:eastAsia="MS Mincho" w:hAnsi="MS Mincho"/>
+          <w:b w:val="false"/>
+          <w:bCs w:val="false"/>
+          <w:sz w:val="24"/>
+          <w:szCs w:val="24"/>
+        </w:rPr>
+        <w:t xml:space="preserve">モースは贈与を支える三つの義務を析出した。第一は「与える義務」（obligation to give）である。社会的地位や名誉ある者は、贈り物をしなければならない。与えることを拒むことは、社会的関係の拒否、すなわち敵対の宣言を意味する。第二は「受け取る義務」（obligation to receive）である。贈り物を受け取らないことは、贈り手を侮辱することになる。受取拒否は対等な関係を否定する行為として理解される。第三は「返礼する義務」（obligation to reciprocate）である。贈られた物に対しては、相応の返礼をしなければならない。返礼を怠ることは、社会的信用の失墜につながる［モース 2014：33-35］。</w:t>
+      </w:r>
+    </w:p>
+    <w:p>
+      <w:pPr>
+        <w:spacing w:after="160" w:before="0"/>
+        <w:ind w:firstLine="480"/>
+      </w:pPr>
+      <w:r>
+        <w:rPr>
+          <w:rFonts w:ascii="MS Mincho" w:cs="MS Mincho" w:eastAsia="MS Mincho" w:hAnsi="MS Mincho"/>
+          <w:b w:val="false"/>
+          <w:bCs w:val="false"/>
+          <w:sz w:val="24"/>
+          <w:szCs w:val="24"/>
+        </w:rPr>
+        <w:t xml:space="preserve">モースにとって重要なのは、贈り物には「贈り手の霊（ハウ）」が宿るという考え方である。物は移転しても、贈り手との関係が断ち切られるわけではない。贈り物には人格が込められており、返礼とはその人格を元の持ち主に返すことを意味する。こうして贈与のサイクルは、人々の間に継続的な社会的絆を生み出す機能を果たすのである［モース 2014：58-60］。</w:t>
+      </w:r>
+    </w:p>
+    <w:p>
+      <w:pPr>
+        <w:spacing w:after="160" w:before="0"/>
+        <w:ind w:firstLine="480"/>
+      </w:pPr>
+      <w:r>
+        <w:rPr>
+          <w:rFonts w:ascii="MS Mincho" w:cs="MS Mincho" w:eastAsia="MS Mincho" w:hAnsi="MS Mincho"/>
+          <w:b w:val="false"/>
+          <w:bCs w:val="false"/>
+          <w:sz w:val="24"/>
+          <w:szCs w:val="24"/>
+        </w:rPr>
+        <w:t xml:space="preserve">また、マーシャル・サーリンズはモースの議論を発展させ、互酬性を「一般的互酬性」「均衡的互酬性」「否定的互酬性」の三類型に整理した［サーリンズ 2012：191-196］。一般的互酬性は見返りを期待しない贈与（親の子への愛情など）、均衡的互酬性は即時の等価返礼（市場交換など）、否定的互酬性は相手の損失において自己利益を得ようとする交換である。日本の贈答慣行の多くは均衡的互酬性の領域に位置しながら、長期的な関係維持という一般的互酬性の要素も帯びている。</w:t>
       </w:r>
     </w:p>
     <w:p>
@@ -163,7 +177,7 @@
     </w:p>
     <w:p>
       <w:pPr>
-        <w:spacing w:after="80" w:before="120"/>
+        <w:spacing w:after="80" w:before="160"/>
       </w:pPr>
       <w:r>
         <w:rPr>
@@ -184,6 +198,8 @@
       <w:r>
         <w:rPr>
           <w:rFonts w:ascii="MS Mincho" w:cs="MS Mincho" w:eastAsia="MS Mincho" w:hAnsi="MS Mincho"/>
+          <w:b w:val="false"/>
+          <w:bCs w:val="false"/>
           <w:sz w:val="24"/>
           <w:szCs w:val="24"/>
         </w:rPr>
@@ -198,6 +214,8 @@
       <w:r>
         <w:rPr>
           <w:rFonts w:ascii="MS Mincho" w:cs="MS Mincho" w:eastAsia="MS Mincho" w:hAnsi="MS Mincho"/>
+          <w:b w:val="false"/>
+          <w:bCs w:val="false"/>
           <w:sz w:val="24"/>
           <w:szCs w:val="24"/>
         </w:rPr>
@@ -212,6 +230,8 @@
       <w:r>
         <w:rPr>
           <w:rFonts w:ascii="MS Mincho" w:cs="MS Mincho" w:eastAsia="MS Mincho" w:hAnsi="MS Mincho"/>
+          <w:b w:val="false"/>
+          <w:bCs w:val="false"/>
           <w:sz w:val="24"/>
           <w:szCs w:val="24"/>
         </w:rPr>
@@ -220,7 +240,7 @@
     </w:p>
     <w:p>
       <w:pPr>
-        <w:spacing w:after="80" w:before="120"/>
+        <w:spacing w:after="80" w:before="160"/>
       </w:pPr>
       <w:r>
         <w:rPr>
@@ -241,6 +261,8 @@
       <w:r>
         <w:rPr>
           <w:rFonts w:ascii="MS Mincho" w:cs="MS Mincho" w:eastAsia="MS Mincho" w:hAnsi="MS Mincho"/>
+          <w:b w:val="false"/>
+          <w:bCs w:val="false"/>
           <w:sz w:val="24"/>
           <w:szCs w:val="24"/>
         </w:rPr>
@@ -255,6 +277,8 @@
       <w:r>
         <w:rPr>
           <w:rFonts w:ascii="MS Mincho" w:cs="MS Mincho" w:eastAsia="MS Mincho" w:hAnsi="MS Mincho"/>
+          <w:b w:val="false"/>
+          <w:bCs w:val="false"/>
           <w:sz w:val="24"/>
           <w:szCs w:val="24"/>
         </w:rPr>
@@ -269,6 +293,8 @@
       <w:r>
         <w:rPr>
           <w:rFonts w:ascii="MS Mincho" w:cs="MS Mincho" w:eastAsia="MS Mincho" w:hAnsi="MS Mincho"/>
+          <w:b w:val="false"/>
+          <w:bCs w:val="false"/>
           <w:sz w:val="24"/>
           <w:szCs w:val="24"/>
         </w:rPr>
@@ -277,7 +303,7 @@
     </w:p>
     <w:p>
       <w:pPr>
-        <w:spacing w:after="80" w:before="120"/>
+        <w:spacing w:after="80" w:before="160"/>
       </w:pPr>
       <w:r>
         <w:rPr>
@@ -298,6 +324,8 @@
       <w:r>
         <w:rPr>
           <w:rFonts w:ascii="MS Mincho" w:cs="MS Mincho" w:eastAsia="MS Mincho" w:hAnsi="MS Mincho"/>
+          <w:b w:val="false"/>
+          <w:bCs w:val="false"/>
           <w:sz w:val="24"/>
           <w:szCs w:val="24"/>
         </w:rPr>
@@ -312,6 +340,8 @@
       <w:r>
         <w:rPr>
           <w:rFonts w:ascii="MS Mincho" w:cs="MS Mincho" w:eastAsia="MS Mincho" w:hAnsi="MS Mincho"/>
+          <w:b w:val="false"/>
+          <w:bCs w:val="false"/>
           <w:sz w:val="24"/>
           <w:szCs w:val="24"/>
         </w:rPr>
@@ -341,6 +371,8 @@
       <w:r>
         <w:rPr>
           <w:rFonts w:ascii="MS Mincho" w:cs="MS Mincho" w:eastAsia="MS Mincho" w:hAnsi="MS Mincho"/>
+          <w:b w:val="false"/>
+          <w:bCs w:val="false"/>
           <w:sz w:val="24"/>
           <w:szCs w:val="24"/>
         </w:rPr>
@@ -355,6 +387,8 @@
       <w:r>
         <w:rPr>
           <w:rFonts w:ascii="MS Mincho" w:cs="MS Mincho" w:eastAsia="MS Mincho" w:hAnsi="MS Mincho"/>
+          <w:b w:val="false"/>
+          <w:bCs w:val="false"/>
           <w:sz w:val="24"/>
           <w:szCs w:val="24"/>
         </w:rPr>
@@ -369,6 +403,8 @@
       <w:r>
         <w:rPr>
           <w:rFonts w:ascii="MS Mincho" w:cs="MS Mincho" w:eastAsia="MS Mincho" w:hAnsi="MS Mincho"/>
+          <w:b w:val="false"/>
+          <w:bCs w:val="false"/>
           <w:sz w:val="24"/>
           <w:szCs w:val="24"/>
         </w:rPr>
@@ -398,6 +434,8 @@
       <w:r>
         <w:rPr>
           <w:rFonts w:ascii="MS Mincho" w:cs="MS Mincho" w:eastAsia="MS Mincho" w:hAnsi="MS Mincho"/>
+          <w:b w:val="false"/>
+          <w:bCs w:val="false"/>
           <w:sz w:val="24"/>
           <w:szCs w:val="24"/>
         </w:rPr>
@@ -412,6 +450,8 @@
       <w:r>
         <w:rPr>
           <w:rFonts w:ascii="MS Mincho" w:cs="MS Mincho" w:eastAsia="MS Mincho" w:hAnsi="MS Mincho"/>
+          <w:b w:val="false"/>
+          <w:bCs w:val="false"/>
           <w:sz w:val="24"/>
           <w:szCs w:val="24"/>
         </w:rPr>
@@ -426,15 +466,29 @@
       <w:r>
         <w:rPr>
           <w:rFonts w:ascii="MS Mincho" w:cs="MS Mincho" w:eastAsia="MS Mincho" w:hAnsi="MS Mincho"/>
-          <w:sz w:val="24"/>
-          <w:szCs w:val="24"/>
-        </w:rPr>
-        <w:t xml:space="preserve">モースは『贈与論』の結論部で、近代の市場経済社会においても贈与の論理は生き続けると述べた。日本の贈答文化は、その命題を現代においても鮮明に体現している事例といえるだろう。</w:t>
-      </w:r>
-    </w:p>
-    <w:p>
-      <w:pPr>
-        <w:spacing w:after="120" w:before="360"/>
+          <w:b w:val="false"/>
+          <w:bCs w:val="false"/>
+          <w:sz w:val="24"/>
+          <w:szCs w:val="24"/>
+        </w:rPr>
+        <w:t xml:space="preserve">モースは『贈与論』の結論部で、近代の市場経済社会においても贈与の論理は生き続けると述べた［モース 2014：207］。日本の贈答文化は、その命題を現代においても鮮明に体現している事例といえるだろう。</w:t>
+      </w:r>
+    </w:p>
+    <w:p>
+      <w:pPr>
+        <w:spacing w:after="0" w:before="360"/>
+      </w:pPr>
+      <w:r>
+        <w:rPr>
+          <w:sz w:val="24"/>
+          <w:szCs w:val="24"/>
+        </w:rPr>
+        <w:t xml:space="preserve"/>
+      </w:r>
+    </w:p>
+    <w:p>
+      <w:pPr>
+        <w:spacing w:after="120" w:before="240"/>
       </w:pPr>
       <w:r>
         <w:rPr>
@@ -449,54 +503,110 @@
     </w:p>
     <w:p>
       <w:pPr>
-        <w:spacing w:after="100" w:before="0"/>
-      </w:pPr>
-      <w:r>
-        <w:rPr>
-          <w:rFonts w:ascii="MS Mincho" w:cs="MS Mincho" w:eastAsia="MS Mincho" w:hAnsi="MS Mincho"/>
-          <w:sz w:val="24"/>
-          <w:szCs w:val="24"/>
-        </w:rPr>
-        <w:t xml:space="preserve">モース、マルセル　2014　『贈与論 他二篇』森山工訳、岩波文庫。</w:t>
-      </w:r>
-    </w:p>
-    <w:p>
-      <w:pPr>
-        <w:spacing w:after="100" w:before="0"/>
-      </w:pPr>
-      <w:r>
-        <w:rPr>
-          <w:rFonts w:ascii="MS Mincho" w:cs="MS Mincho" w:eastAsia="MS Mincho" w:hAnsi="MS Mincho"/>
-          <w:sz w:val="24"/>
-          <w:szCs w:val="24"/>
-        </w:rPr>
-        <w:t xml:space="preserve">サーリンズ、マーシャル　2012　『石器時代の経済学』山内昶訳、法政大学出版局。</w:t>
-      </w:r>
-    </w:p>
-    <w:p>
-      <w:pPr>
-        <w:spacing w:after="100" w:before="0"/>
-      </w:pPr>
-      <w:r>
-        <w:rPr>
-          <w:rFonts w:ascii="MS Mincho" w:cs="MS Mincho" w:eastAsia="MS Mincho" w:hAnsi="MS Mincho"/>
-          <w:sz w:val="24"/>
-          <w:szCs w:val="24"/>
-        </w:rPr>
-        <w:t xml:space="preserve">マリノフスキー、ブロニスワフ　2010　『西太平洋の遠洋航海者』増田義郎訳、講談社学術文庫。</w:t>
-      </w:r>
-    </w:p>
-    <w:p>
-      <w:pPr>
-        <w:spacing w:after="100" w:before="0"/>
-      </w:pPr>
-      <w:r>
-        <w:rPr>
-          <w:rFonts w:ascii="MS Mincho" w:cs="MS Mincho" w:eastAsia="MS Mincho" w:hAnsi="MS Mincho"/>
-          <w:sz w:val="24"/>
-          <w:szCs w:val="24"/>
-        </w:rPr>
-        <w:t xml:space="preserve">ベル裕紀　2025　「文化人類学　第4回：贈与と互酬性」法政大学講義資料。</w:t>
+        <w:spacing w:after="40" w:before="0"/>
+      </w:pPr>
+      <w:r>
+        <w:rPr>
+          <w:rFonts w:ascii="MS Mincho" w:cs="MS Mincho" w:eastAsia="MS Mincho" w:hAnsi="MS Mincho"/>
+          <w:sz w:val="24"/>
+          <w:szCs w:val="24"/>
+        </w:rPr>
+        <w:t xml:space="preserve">モース、マルセル</w:t>
+      </w:r>
+    </w:p>
+    <w:p>
+      <w:pPr>
+        <w:spacing w:after="120" w:before="0"/>
+        <w:ind w:left="480"/>
+      </w:pPr>
+      <w:r>
+        <w:rPr>
+          <w:rFonts w:ascii="MS Mincho" w:cs="MS Mincho" w:eastAsia="MS Mincho" w:hAnsi="MS Mincho"/>
+          <w:sz w:val="24"/>
+          <w:szCs w:val="24"/>
+        </w:rPr>
+        <w:t xml:space="preserve">2014　『贈与論 他二篇』森山工訳、岩波文庫。</w:t>
+      </w:r>
+    </w:p>
+    <w:p>
+      <w:pPr>
+        <w:spacing w:after="40" w:before="0"/>
+      </w:pPr>
+      <w:r>
+        <w:rPr>
+          <w:rFonts w:ascii="MS Mincho" w:cs="MS Mincho" w:eastAsia="MS Mincho" w:hAnsi="MS Mincho"/>
+          <w:sz w:val="24"/>
+          <w:szCs w:val="24"/>
+        </w:rPr>
+        <w:t xml:space="preserve">サーリンズ、マーシャル</w:t>
+      </w:r>
+    </w:p>
+    <w:p>
+      <w:pPr>
+        <w:spacing w:after="120" w:before="0"/>
+        <w:ind w:left="480"/>
+      </w:pPr>
+      <w:r>
+        <w:rPr>
+          <w:rFonts w:ascii="MS Mincho" w:cs="MS Mincho" w:eastAsia="MS Mincho" w:hAnsi="MS Mincho"/>
+          <w:sz w:val="24"/>
+          <w:szCs w:val="24"/>
+        </w:rPr>
+        <w:t xml:space="preserve">2012　『石器時代の経済学』山内昶訳、法政大学出版局。</w:t>
+      </w:r>
+    </w:p>
+    <w:p>
+      <w:pPr>
+        <w:spacing w:after="40" w:before="0"/>
+      </w:pPr>
+      <w:r>
+        <w:rPr>
+          <w:rFonts w:ascii="MS Mincho" w:cs="MS Mincho" w:eastAsia="MS Mincho" w:hAnsi="MS Mincho"/>
+          <w:sz w:val="24"/>
+          <w:szCs w:val="24"/>
+        </w:rPr>
+        <w:t xml:space="preserve">マリノフスキー、ブロニスワフ</w:t>
+      </w:r>
+    </w:p>
+    <w:p>
+      <w:pPr>
+        <w:spacing w:after="120" w:before="0"/>
+        <w:ind w:left="480"/>
+      </w:pPr>
+      <w:r>
+        <w:rPr>
+          <w:rFonts w:ascii="MS Mincho" w:cs="MS Mincho" w:eastAsia="MS Mincho" w:hAnsi="MS Mincho"/>
+          <w:sz w:val="24"/>
+          <w:szCs w:val="24"/>
+        </w:rPr>
+        <w:t xml:space="preserve">2010　『西太平洋の遠洋航海者』増田義郎訳、講談社学術文庫。</w:t>
+      </w:r>
+    </w:p>
+    <w:p>
+      <w:pPr>
+        <w:spacing w:after="40" w:before="0"/>
+      </w:pPr>
+      <w:r>
+        <w:rPr>
+          <w:rFonts w:ascii="MS Mincho" w:cs="MS Mincho" w:eastAsia="MS Mincho" w:hAnsi="MS Mincho"/>
+          <w:sz w:val="24"/>
+          <w:szCs w:val="24"/>
+        </w:rPr>
+        <w:t xml:space="preserve">ベル裕紀</w:t>
+      </w:r>
+    </w:p>
+    <w:p>
+      <w:pPr>
+        <w:spacing w:after="120" w:before="0"/>
+        <w:ind w:left="480"/>
+      </w:pPr>
+      <w:r>
+        <w:rPr>
+          <w:rFonts w:ascii="MS Mincho" w:cs="MS Mincho" w:eastAsia="MS Mincho" w:hAnsi="MS Mincho"/>
+          <w:sz w:val="24"/>
+          <w:szCs w:val="24"/>
+        </w:rPr>
+        <w:t xml:space="preserve">2025　「文化人類学　第4回：贈与と互酬性」法政大学講義資料。</w:t>
       </w:r>
     </w:p>
     <w:sectPr>
@@ -685,13 +795,7 @@
 <file path=word/styles.xml><?xml version="1.0" encoding="utf-8"?>
 <w:styles xmlns:mc="http://schemas.openxmlformats.org/markup-compatibility/2006" xmlns:r="http://schemas.openxmlformats.org/officeDocument/2006/relationships" xmlns:w="http://schemas.openxmlformats.org/wordprocessingml/2006/main" xmlns:w14="http://schemas.microsoft.com/office/word/2010/wordml" xmlns:w15="http://schemas.microsoft.com/office/word/2012/wordml" mc:Ignorable="w14 w15">
   <w:docDefaults>
-    <w:rPrDefault>
-      <w:rPr>
-        <w:rFonts w:ascii="MS Mincho" w:cs="MS Mincho" w:eastAsia="MS Mincho" w:hAnsi="MS Mincho"/>
-        <w:sz w:val="24"/>
-        <w:szCs w:val="24"/>
-      </w:rPr>
-    </w:rPrDefault>
+    <w:rPrDefault/>
     <w:pPrDefault/>
   </w:docDefaults>
   <w:style w:type="paragraph" w:styleId="Title">
@@ -865,20 +969,5 @@
       <w:szCs w:val="20"/>
     </w:rPr>
   </w:style>
-  <w:style w:type="paragraph" w:styleId="heading1">
-    <w:name w:val="Heading 1"/>
-    <w:basedOn w:val="Normal"/>
-    <w:next w:val="Normal"/>
-    <w:pPr>
-      <w:spacing w:after="120" w:before="240"/>
-    </w:pPr>
-    <w:rPr>
-      <w:rFonts w:ascii="MS Gothic" w:cs="MS Gothic" w:eastAsia="MS Gothic" w:hAnsi="MS Gothic"/>
-      <w:b/>
-      <w:bCs/>
-      <w:sz w:val="26"/>
-      <w:szCs w:val="26"/>
-    </w:rPr>
-  </w:style>
 </w:styles>
 </file>
</xml_diff>

<commit_message>
Add student info to essay header
</commit_message>
<xml_diff>
--- a/cultural_anthropology_essay.docx
+++ b/cultural_anthropology_essay.docx
@@ -20,6 +20,22 @@
     </w:p>
     <w:p>
       <w:pPr>
+        <w:spacing w:after="120" w:before="0"/>
+        <w:jc w:val="center"/>
+      </w:pPr>
+      <w:r>
+        <w:rPr>
+          <w:rFonts w:ascii="MS Mincho" w:cs="MS Mincho" w:eastAsia="MS Mincho" w:hAnsi="MS Mincho"/>
+          <w:b w:val="false"/>
+          <w:bCs w:val="false"/>
+          <w:sz w:val="24"/>
+          <w:szCs w:val="24"/>
+        </w:rPr>
+        <w:t xml:space="preserve">文化人類学　レポート</w:t>
+      </w:r>
+    </w:p>
+    <w:p>
+      <w:pPr>
         <w:spacing w:after="400" w:before="0"/>
         <w:jc w:val="center"/>
       </w:pPr>
@@ -31,7 +47,7 @@
           <w:sz w:val="24"/>
           <w:szCs w:val="24"/>
         </w:rPr>
-        <w:t xml:space="preserve">文化人類学　レポート</w:t>
+        <w:t xml:space="preserve">経営学部経営戦略学科　１年　O組　26F1435　嘉永島大馳</w:t>
       </w:r>
     </w:p>
     <w:p>

</xml_diff>

<commit_message>
Update source essay files with corrected references
</commit_message>
<xml_diff>
--- a/cultural_anthropology_essay.docx
+++ b/cultural_anthropology_essay.docx
@@ -548,7 +548,7 @@
           <w:sz w:val="22"/>
           <w:szCs w:val="22"/>
         </w:rPr>
-        <w:t xml:space="preserve">2014　『贈与論 他二篇』森山工訳、岩波文庫。</w:t>
+        <w:t xml:space="preserve">2014　『贈与論 他二篇』、森山工訳、岩波文庫。</w:t>
       </w:r>
     </w:p>
     <w:p>
@@ -579,7 +579,7 @@
           <w:sz w:val="22"/>
           <w:szCs w:val="22"/>
         </w:rPr>
-        <w:t xml:space="preserve">2012　『石器時代の経済学』山内昶訳、法政大学出版局。</w:t>
+        <w:t xml:space="preserve">2012　『石器時代の経済学』山内 昶訳、法政大学出版局。</w:t>
       </w:r>
     </w:p>
     <w:p>

</xml_diff>